<commit_message>
Update overview doc for the TMC command-center (map, ops KPIs, corridors, device health, cameras, timeline)
Co-Authored-By: Claude Opus 4.8 (1M context) <noreply@anthropic.com>
</commit_message>
<xml_diff>
--- a/Signal Performance Dashboard Overview.docx
+++ b/Signal Performance Dashboard Overview.docx
@@ -401,6 +401,101 @@
           <w:b/>
         </w:rPr>
         <w:t xml:space="preserve">reads data → ranks the worst lights → flags emergencies.</w:t>
+      </w:r>
+    </w:p>
+    <w:p>
+      <w:pPr>
+        <w:pStyle w:val="BodyText"/>
+      </w:pPr>
+      <w:r>
+        <w:t xml:space="preserve">It is laid out like a</w:t>
+      </w:r>
+      <w:r>
+        <w:t xml:space="preserve"> </w:t>
+      </w:r>
+      <w:r>
+        <w:rPr>
+          <w:bCs/>
+          <w:b/>
+        </w:rPr>
+        <w:t xml:space="preserve">Traffic Management Center (TMC)</w:t>
+      </w:r>
+      <w:r>
+        <w:t xml:space="preserve">, so it answers two</w:t>
+      </w:r>
+      <w:r>
+        <w:t xml:space="preserve"> </w:t>
+      </w:r>
+      <w:r>
+        <w:t xml:space="preserve">questions at once:</w:t>
+      </w:r>
+      <w:r>
+        <w:t xml:space="preserve"> </w:t>
+      </w:r>
+      <w:r>
+        <w:rPr>
+          <w:iCs/>
+          <w:i/>
+        </w:rPr>
+        <w:t xml:space="preserve">“</w:t>
+      </w:r>
+      <w:r>
+        <w:rPr>
+          <w:iCs/>
+          <w:i/>
+        </w:rPr>
+        <w:t xml:space="preserve">which signal do I fix first?</w:t>
+      </w:r>
+      <w:r>
+        <w:rPr>
+          <w:iCs/>
+          <w:i/>
+        </w:rPr>
+        <w:t xml:space="preserve">”</w:t>
+      </w:r>
+      <w:r>
+        <w:t xml:space="preserve"> </w:t>
+      </w:r>
+      <w:r>
+        <w:t xml:space="preserve">and</w:t>
+      </w:r>
+      <w:r>
+        <w:t xml:space="preserve"> </w:t>
+      </w:r>
+      <w:r>
+        <w:rPr>
+          <w:iCs/>
+          <w:i/>
+        </w:rPr>
+        <w:t xml:space="preserve">“</w:t>
+      </w:r>
+      <w:r>
+        <w:rPr>
+          <w:iCs/>
+          <w:i/>
+        </w:rPr>
+        <w:t xml:space="preserve">what is happening across</w:t>
+      </w:r>
+      <w:r>
+        <w:rPr>
+          <w:iCs/>
+          <w:i/>
+        </w:rPr>
+        <w:t xml:space="preserve"> </w:t>
+      </w:r>
+      <w:r>
+        <w:rPr>
+          <w:iCs/>
+          <w:i/>
+        </w:rPr>
+        <w:t xml:space="preserve">the whole network right now?</w:t>
+      </w:r>
+      <w:r>
+        <w:rPr>
+          <w:iCs/>
+          <w:i/>
+        </w:rPr>
+        <w:t xml:space="preserve">”</w:t>
       </w:r>
     </w:p>
     <w:p>
@@ -787,36 +882,67 @@
         <w:t xml:space="preserve"> </w:t>
       </w:r>
       <w:r>
-        <w:rPr>
-          <w:bCs/>
-          <w:b/>
-        </w:rPr>
-        <w:t xml:space="preserve">91</w:t>
-      </w:r>
-      <w:r>
-        <w:t xml:space="preserve">, 64% of cars hit red, and the green ran out</w:t>
-      </w:r>
-      <w:r>
-        <w:t xml:space="preserve"> </w:t>
-      </w:r>
-      <w:r>
-        <w:rPr>
-          <w:bCs/>
-          <w:b/>
-        </w:rPr>
-        <w:t xml:space="preserve">113</w:t>
-      </w:r>
-      <w:r>
-        <w:t xml:space="preserve"> </w:t>
-      </w:r>
-      <w:r>
-        <w:t xml:space="preserve">times in evening rush.</w:t>
-      </w:r>
-      <w:r>
-        <w:t xml:space="preserve"> </w:t>
-      </w:r>
-      <w:r>
-        <w:t xml:space="preserve">The next signal is only 42. That big gap is the story:</w:t>
+        <w:t xml:space="preserve">around</w:t>
+      </w:r>
+      <w:r>
+        <w:t xml:space="preserve"> </w:t>
+      </w:r>
+      <w:r>
+        <w:rPr>
+          <w:bCs/>
+          <w:b/>
+        </w:rPr>
+        <w:t xml:space="preserve">90</w:t>
+      </w:r>
+      <w:r>
+        <w:t xml:space="preserve"> </w:t>
+      </w:r>
+      <w:r>
+        <w:t xml:space="preserve">(High), with roughly</w:t>
+      </w:r>
+      <w:r>
+        <w:t xml:space="preserve"> </w:t>
+      </w:r>
+      <w:r>
+        <w:rPr>
+          <w:bCs/>
+          <w:b/>
+        </w:rPr>
+        <w:t xml:space="preserve">64%</w:t>
+      </w:r>
+      <w:r>
+        <w:t xml:space="preserve"> </w:t>
+      </w:r>
+      <w:r>
+        <w:t xml:space="preserve">of cars hitting red and</w:t>
+      </w:r>
+      <w:r>
+        <w:t xml:space="preserve"> </w:t>
+      </w:r>
+      <w:r>
+        <w:rPr>
+          <w:bCs/>
+          <w:b/>
+        </w:rPr>
+        <w:t xml:space="preserve">100+</w:t>
+      </w:r>
+      <w:r>
+        <w:t xml:space="preserve"> </w:t>
+      </w:r>
+      <w:r>
+        <w:t xml:space="preserve">split</w:t>
+      </w:r>
+      <w:r>
+        <w:t xml:space="preserve"> </w:t>
+      </w:r>
+      <w:r>
+        <w:t xml:space="preserve">failures in evening rush. The next signal scores far lower. That big gap is the</w:t>
+      </w:r>
+      <w:r>
+        <w:t xml:space="preserve"> </w:t>
+      </w:r>
+      <w:r>
+        <w:t xml:space="preserve">story:</w:t>
       </w:r>
       <w:r>
         <w:t xml:space="preserve"> </w:t>
@@ -832,13 +958,13 @@
         <w:t xml:space="preserve"> </w:t>
       </w:r>
       <w:r>
-        <w:t xml:space="preserve">light is genuinely</w:t>
-      </w:r>
-      <w:r>
-        <w:t xml:space="preserve"> </w:t>
-      </w:r>
-      <w:r>
-        <w:t xml:space="preserve">bad, the rest are basically fine. →</w:t>
+        <w:t xml:space="preserve">light is genuinely bad, the rest are basically fine.</w:t>
+      </w:r>
+      <w:r>
+        <w:t xml:space="preserve"> </w:t>
+      </w:r>
+      <w:r>
+        <w:t xml:space="preserve">→</w:t>
       </w:r>
       <w:r>
         <w:t xml:space="preserve"> </w:t>
@@ -869,6 +995,71 @@
       </w:pPr>
       <w:r>
         <w:t xml:space="preserve">5. The dashboard, region by region</w:t>
+      </w:r>
+    </w:p>
+    <w:p>
+      <w:pPr>
+        <w:pStyle w:val="FirstParagraph"/>
+      </w:pPr>
+      <w:r>
+        <w:t xml:space="preserve">It is a dark, dense</w:t>
+      </w:r>
+      <w:r>
+        <w:t xml:space="preserve"> </w:t>
+      </w:r>
+      <w:r>
+        <w:rPr>
+          <w:bCs/>
+          <w:b/>
+        </w:rPr>
+        <w:t xml:space="preserve">command-center</w:t>
+      </w:r>
+      <w:r>
+        <w:t xml:space="preserve"> </w:t>
+      </w:r>
+      <w:r>
+        <w:t xml:space="preserve">layout with two pages:</w:t>
+      </w:r>
+      <w:r>
+        <w:t xml:space="preserve"> </w:t>
+      </w:r>
+      <w:r>
+        <w:rPr>
+          <w:bCs/>
+          <w:b/>
+        </w:rPr>
+        <w:t xml:space="preserve">Operations</w:t>
+      </w:r>
+      <w:r>
+        <w:t xml:space="preserve"> </w:t>
+      </w:r>
+      <w:r>
+        <w:t xml:space="preserve">and</w:t>
+      </w:r>
+      <w:r>
+        <w:t xml:space="preserve"> </w:t>
+      </w:r>
+      <w:r>
+        <w:rPr>
+          <w:bCs/>
+          <w:b/>
+        </w:rPr>
+        <w:t xml:space="preserve">Corridors</w:t>
+      </w:r>
+      <w:r>
+        <w:t xml:space="preserve">.</w:t>
+      </w:r>
+    </w:p>
+    <w:p>
+      <w:pPr>
+        <w:pStyle w:val="BodyText"/>
+      </w:pPr>
+      <w:r>
+        <w:rPr>
+          <w:bCs/>
+          <w:b/>
+        </w:rPr>
+        <w:t xml:space="preserve">Operations page</w:t>
       </w:r>
     </w:p>
     <w:p>
@@ -884,19 +1075,19 @@
           <w:bCs/>
           <w:b/>
         </w:rPr>
-        <w:t xml:space="preserve">Network Health donut (top-left).</w:t>
-      </w:r>
-      <w:r>
-        <w:t xml:space="preserve"> </w:t>
-      </w:r>
-      <w:r>
-        <w:t xml:space="preserve">A ring split into High / Medium / Low. The</w:t>
-      </w:r>
-      <w:r>
-        <w:t xml:space="preserve"> </w:t>
-      </w:r>
-      <w:r>
-        <w:t xml:space="preserve">big center number = how many signals need attention.</w:t>
+        <w:t xml:space="preserve">Operations KPI strip (top).</w:t>
+      </w:r>
+      <w:r>
+        <w:t xml:space="preserve"> </w:t>
+      </w:r>
+      <w:r>
+        <w:t xml:space="preserve">Six live operational numbers: Signals Online,</w:t>
+      </w:r>
+      <w:r>
+        <w:t xml:space="preserve"> </w:t>
+      </w:r>
+      <w:r>
+        <w:t xml:space="preserve">Signals Offline, Active Alerts, High Priority, Network Health %, Avg Delay.</w:t>
       </w:r>
     </w:p>
     <w:p>
@@ -912,25 +1103,19 @@
           <w:bCs/>
           <w:b/>
         </w:rPr>
-        <w:t xml:space="preserve">KPI tiles (top center).</w:t>
-      </w:r>
-      <w:r>
-        <w:t xml:space="preserve"> </w:t>
-      </w:r>
-      <w:r>
-        <w:t xml:space="preserve">Four headline numbers, Total Volume, Avg</w:t>
-      </w:r>
-      <w:r>
-        <w:t xml:space="preserve"> </w:t>
-      </w:r>
-      <w:r>
-        <w:t xml:space="preserve">Arrivals-on-Red, Split Failures, High-Priority count, each with an up/down</w:t>
-      </w:r>
-      <w:r>
-        <w:t xml:space="preserve"> </w:t>
-      </w:r>
-      <w:r>
-        <w:t xml:space="preserve">arrow vs. the previous period (green = better, red = worse).</w:t>
+        <w:t xml:space="preserve">Network Health donut (left rail).</w:t>
+      </w:r>
+      <w:r>
+        <w:t xml:space="preserve"> </w:t>
+      </w:r>
+      <w:r>
+        <w:t xml:space="preserve">A ring split into High / Medium / Low. The</w:t>
+      </w:r>
+      <w:r>
+        <w:t xml:space="preserve"> </w:t>
+      </w:r>
+      <w:r>
+        <w:t xml:space="preserve">big center number = how many signals need attention.</w:t>
       </w:r>
     </w:p>
     <w:p>
@@ -946,98 +1131,25 @@
           <w:bCs/>
           <w:b/>
         </w:rPr>
-        <w:t xml:space="preserve">Hero panel (center).</w:t>
-      </w:r>
-      <w:r>
-        <w:t xml:space="preserve"> </w:t>
-      </w:r>
-      <w:r>
-        <w:t xml:space="preserve">A switcher with three views:</w:t>
-      </w:r>
-    </w:p>
-    <w:p>
-      <w:pPr>
-        <w:numPr>
-          <w:ilvl w:val="1"/>
-          <w:numId w:val="1003"/>
-        </w:numPr>
-        <w:pStyle w:val="Compact"/>
-      </w:pPr>
-      <w:r>
-        <w:rPr>
-          <w:bCs/>
-          <w:b/>
-        </w:rPr>
-        <w:t xml:space="preserve">Trend</w:t>
-      </w:r>
-      <w:r>
-        <w:t xml:space="preserve">, arrivals-on-red over the day for the main signals (a pulsing dot</w:t>
-      </w:r>
-      <w:r>
-        <w:t xml:space="preserve"> </w:t>
-      </w:r>
-      <w:r>
-        <w:t xml:space="preserve">marks an anomaly), plus a split-failure heatmap underneath.</w:t>
-      </w:r>
-    </w:p>
-    <w:p>
-      <w:pPr>
-        <w:numPr>
-          <w:ilvl w:val="1"/>
-          <w:numId w:val="1003"/>
-        </w:numPr>
-        <w:pStyle w:val="Compact"/>
-      </w:pPr>
-      <w:r>
-        <w:rPr>
-          <w:bCs/>
-          <w:b/>
-        </w:rPr>
-        <w:t xml:space="preserve">Retiming Queue</w:t>
-      </w:r>
-      <w:r>
-        <w:t xml:space="preserve">, the full ranked table of all 12 signals.</w:t>
-      </w:r>
-    </w:p>
-    <w:p>
-      <w:pPr>
-        <w:numPr>
-          <w:ilvl w:val="1"/>
-          <w:numId w:val="1003"/>
-        </w:numPr>
-        <w:pStyle w:val="Compact"/>
-      </w:pPr>
-      <w:r>
-        <w:rPr>
-          <w:bCs/>
-          <w:b/>
-        </w:rPr>
-        <w:t xml:space="preserve">Heatmap</w:t>
-      </w:r>
-      <w:r>
-        <w:t xml:space="preserve">, split failures by signal × hour (the red band shows</w:t>
-      </w:r>
-      <w:r>
-        <w:t xml:space="preserve"> </w:t>
-      </w:r>
-      <w:r>
-        <w:rPr>
-          <w:iCs/>
-          <w:i/>
-        </w:rPr>
-        <w:t xml:space="preserve">when</w:t>
-      </w:r>
-      <w:r>
-        <w:t xml:space="preserve"> </w:t>
-      </w:r>
-      <w:r>
-        <w:t xml:space="preserve">a</w:t>
-      </w:r>
-      <w:r>
-        <w:t xml:space="preserve"> </w:t>
-      </w:r>
-      <w:r>
-        <w:t xml:space="preserve">light jams, e.g. 5-7pm).</w:t>
+        <w:t xml:space="preserve">Live Incident Feed (left rail).</w:t>
+      </w:r>
+      <w:r>
+        <w:t xml:space="preserve"> </w:t>
+      </w:r>
+      <w:r>
+        <w:t xml:space="preserve">A TMC-style event log of abnormal behavior,</w:t>
+      </w:r>
+      <w:r>
+        <w:t xml:space="preserve"> </w:t>
+      </w:r>
+      <w:r>
+        <w:t xml:space="preserve">newest first, each with a type icon (detector failure, split failures, high</w:t>
+      </w:r>
+      <w:r>
+        <w:t xml:space="preserve"> </w:t>
+      </w:r>
+      <w:r>
+        <w:t xml:space="preserve">arrivals-on-red) and a red/amber severity edge. Click one to open the signal.</w:t>
       </w:r>
     </w:p>
     <w:p>
@@ -1053,19 +1165,126 @@
           <w:bCs/>
           <w:b/>
         </w:rPr>
-        <w:t xml:space="preserve">Recent Alerts (left rail).</w:t>
-      </w:r>
-      <w:r>
-        <w:t xml:space="preserve"> </w:t>
-      </w:r>
-      <w:r>
-        <w:t xml:space="preserve">A live-feeling list of abnormal behavior, newest</w:t>
-      </w:r>
-      <w:r>
-        <w:t xml:space="preserve"> </w:t>
-      </w:r>
-      <w:r>
-        <w:t xml:space="preserve">first, color-coded by severity.</w:t>
+        <w:t xml:space="preserve">Traffic Network map (center, the centerpiece).</w:t>
+      </w:r>
+      <w:r>
+        <w:t xml:space="preserve"> </w:t>
+      </w:r>
+      <w:r>
+        <w:t xml:space="preserve">A real interactive map</w:t>
+      </w:r>
+      <w:r>
+        <w:t xml:space="preserve"> </w:t>
+      </w:r>
+      <w:r>
+        <w:t xml:space="preserve">(OpenStreetMap) with every intersection as a marker, colored by priority</w:t>
+      </w:r>
+      <w:r>
+        <w:t xml:space="preserve"> </w:t>
+      </w:r>
+      <w:r>
+        <w:t xml:space="preserve">(green = healthy, amber = medium, red = high). Click a marker for a popup with</w:t>
+      </w:r>
+      <w:r>
+        <w:t xml:space="preserve"> </w:t>
+      </w:r>
+      <w:r>
+        <w:t xml:space="preserve">score, arrivals-on-red, split failures, ped delay, and a recommendation, then</w:t>
+      </w:r>
+      <w:r>
+        <w:t xml:space="preserve"> </w:t>
+      </w:r>
+      <w:r>
+        <w:t xml:space="preserve">open the full detail. A small switcher flips the center between</w:t>
+      </w:r>
+      <w:r>
+        <w:t xml:space="preserve"> </w:t>
+      </w:r>
+      <w:r>
+        <w:rPr>
+          <w:bCs/>
+          <w:b/>
+        </w:rPr>
+        <w:t xml:space="preserve">Map</w:t>
+      </w:r>
+      <w:r>
+        <w:t xml:space="preserve">,</w:t>
+      </w:r>
+      <w:r>
+        <w:t xml:space="preserve"> </w:t>
+      </w:r>
+      <w:r>
+        <w:rPr>
+          <w:bCs/>
+          <w:b/>
+        </w:rPr>
+        <w:t xml:space="preserve">Trend</w:t>
+      </w:r>
+      <w:r>
+        <w:t xml:space="preserve"> </w:t>
+      </w:r>
+      <w:r>
+        <w:t xml:space="preserve">(arrivals-on-red by hour with anomaly pulses + a split-failure</w:t>
+      </w:r>
+      <w:r>
+        <w:t xml:space="preserve"> </w:t>
+      </w:r>
+      <w:r>
+        <w:t xml:space="preserve">heatmap),</w:t>
+      </w:r>
+      <w:r>
+        <w:t xml:space="preserve"> </w:t>
+      </w:r>
+      <w:r>
+        <w:rPr>
+          <w:bCs/>
+          <w:b/>
+        </w:rPr>
+        <w:t xml:space="preserve">Queue</w:t>
+      </w:r>
+      <w:r>
+        <w:t xml:space="preserve"> </w:t>
+      </w:r>
+      <w:r>
+        <w:t xml:space="preserve">(the full ranked table), and</w:t>
+      </w:r>
+      <w:r>
+        <w:t xml:space="preserve"> </w:t>
+      </w:r>
+      <w:r>
+        <w:rPr>
+          <w:bCs/>
+          <w:b/>
+        </w:rPr>
+        <w:t xml:space="preserve">Heatmap</w:t>
+      </w:r>
+      <w:r>
+        <w:t xml:space="preserve"> </w:t>
+      </w:r>
+      <w:r>
+        <w:t xml:space="preserve">(split failures by</w:t>
+      </w:r>
+      <w:r>
+        <w:t xml:space="preserve"> </w:t>
+      </w:r>
+      <w:r>
+        <w:t xml:space="preserve">signal × hour, the red band shows</w:t>
+      </w:r>
+      <w:r>
+        <w:t xml:space="preserve"> </w:t>
+      </w:r>
+      <w:r>
+        <w:rPr>
+          <w:iCs/>
+          <w:i/>
+        </w:rPr>
+        <w:t xml:space="preserve">when</w:t>
+      </w:r>
+      <w:r>
+        <w:t xml:space="preserve"> </w:t>
+      </w:r>
+      <w:r>
+        <w:t xml:space="preserve">a light jams).</w:t>
       </w:r>
     </w:p>
     <w:p>
@@ -1087,7 +1306,13 @@
         <w:t xml:space="preserve"> </w:t>
       </w:r>
       <w:r>
-        <w:t xml:space="preserve">The top 5 worst signals at a glance.</w:t>
+        <w:t xml:space="preserve">The top 5 worst signals at a glance, with score</w:t>
+      </w:r>
+      <w:r>
+        <w:t xml:space="preserve"> </w:t>
+      </w:r>
+      <w:r>
+        <w:t xml:space="preserve">bars and priority pills.</w:t>
       </w:r>
     </w:p>
     <w:p>
@@ -1103,13 +1328,19 @@
           <w:bCs/>
           <w:b/>
         </w:rPr>
-        <w:t xml:space="preserve">Bottom strip.</w:t>
-      </w:r>
-      <w:r>
-        <w:t xml:space="preserve"> </w:t>
-      </w:r>
-      <w:r>
-        <w:t xml:space="preserve">Network totals for the four metrics with icons.</w:t>
+        <w:t xml:space="preserve">Device Health (right rail).</w:t>
+      </w:r>
+      <w:r>
+        <w:t xml:space="preserve"> </w:t>
+      </w:r>
+      <w:r>
+        <w:t xml:space="preserve">Signals online/offline, detector failures,</w:t>
+      </w:r>
+      <w:r>
+        <w:t xml:space="preserve"> </w:t>
+      </w:r>
+      <w:r>
+        <w:t xml:space="preserve">communication failures, and network uptime, like infrastructure monitoring.</w:t>
       </w:r>
     </w:p>
     <w:p>
@@ -1125,19 +1356,13 @@
           <w:bCs/>
           <w:b/>
         </w:rPr>
-        <w:t xml:space="preserve">Signal detail drawer.</w:t>
-      </w:r>
-      <w:r>
-        <w:t xml:space="preserve"> </w:t>
-      </w:r>
-      <w:r>
-        <w:t xml:space="preserve">Click any signal → a panel slides in with its score, the score breakdown (55/30/15), its current metrics, and a fault warning if a</w:t>
-      </w:r>
-      <w:r>
-        <w:t xml:space="preserve"> </w:t>
-      </w:r>
-      <w:r>
-        <w:t xml:space="preserve">detector looks broken.</w:t>
+        <w:t xml:space="preserve">Traffic Cameras (bottom).</w:t>
+      </w:r>
+      <w:r>
+        <w:t xml:space="preserve"> </w:t>
+      </w:r>
+      <w:r>
+        <w:t xml:space="preserve">A strip of camera feeds (placeholder/demo).</w:t>
       </w:r>
     </w:p>
     <w:p>
@@ -1153,51 +1378,13 @@
           <w:bCs/>
           <w:b/>
         </w:rPr>
-        <w:t xml:space="preserve">Theme toggle.</w:t>
-      </w:r>
-      <w:r>
-        <w:t xml:space="preserve"> </w:t>
-      </w:r>
-      <w:r>
-        <w:t xml:space="preserve">Dark (navy</w:t>
-      </w:r>
-      <w:r>
-        <w:t xml:space="preserve"> </w:t>
-      </w:r>
-      <w:r>
-        <w:t xml:space="preserve">“</w:t>
-      </w:r>
-      <w:r>
-        <w:t xml:space="preserve">command center</w:t>
-      </w:r>
-      <w:r>
-        <w:t xml:space="preserve">”</w:t>
-      </w:r>
-      <w:r>
-        <w:t xml:space="preserve">) or light. Follows your system</w:t>
-      </w:r>
-      <w:r>
-        <w:t xml:space="preserve"> </w:t>
-      </w:r>
-      <w:r>
-        <w:t xml:space="preserve">setting by default.</w:t>
-      </w:r>
-    </w:p>
-    <w:p>
-      <w:r>
-        <w:pict>
-          <v:rect style="width:0;height:1.5pt" o:hralign="center" o:hrstd="t" o:hr="t"/>
-        </w:pict>
-      </w:r>
-    </w:p>
-    <w:bookmarkEnd w:id="25"/>
-    <w:bookmarkStart w:id="26" w:name="the-chatbot-assistant-what-it-does"/>
-    <w:p>
-      <w:pPr>
-        <w:pStyle w:val="Heading2"/>
-      </w:pPr>
-      <w:r>
-        <w:t xml:space="preserve">6. The chatbot / assistant: what it does</w:t>
+        <w:t xml:space="preserve">Metric totals (bottom).</w:t>
+      </w:r>
+      <w:r>
+        <w:t xml:space="preserve"> </w:t>
+      </w:r>
+      <w:r>
+        <w:t xml:space="preserve">Network totals for the four metrics with icons.</w:t>
       </w:r>
     </w:p>
     <w:p>
@@ -1205,417 +1392,51 @@
         <w:pStyle w:val="FirstParagraph"/>
       </w:pPr>
       <w:r>
-        <w:t xml:space="preserve">The floating chat button (bottom-right) opens a</w:t>
-      </w:r>
-      <w:r>
-        <w:t xml:space="preserve"> </w:t>
-      </w:r>
-      <w:r>
-        <w:rPr>
-          <w:bCs/>
-          <w:b/>
-        </w:rPr>
-        <w:t xml:space="preserve">grounded helper.</w:t>
-      </w:r>
-      <w:r>
-        <w:t xml:space="preserve"> </w:t>
-      </w:r>
-      <w:r>
-        <w:t xml:space="preserve">“</w:t>
-      </w:r>
-      <w:r>
-        <w:t xml:space="preserve">Grounded</w:t>
-      </w:r>
-      <w:r>
-        <w:t xml:space="preserve">”</w:t>
-      </w:r>
-      <w:r>
-        <w:t xml:space="preserve"> </w:t>
-      </w:r>
-      <w:r>
-        <w:t xml:space="preserve">means it answers</w:t>
-      </w:r>
-      <w:r>
-        <w:t xml:space="preserve"> </w:t>
-      </w:r>
-      <w:r>
-        <w:rPr>
-          <w:bCs/>
-          <w:b/>
-        </w:rPr>
-        <w:t xml:space="preserve">only from the dashboard’s live numbers</w:t>
-      </w:r>
-      <w:r>
-        <w:t xml:space="preserve">, it cannot make things</w:t>
-      </w:r>
-      <w:r>
-        <w:t xml:space="preserve"> </w:t>
-      </w:r>
-      <w:r>
-        <w:t xml:space="preserve">up, and it has no API key or internet call. It reads the same computed data the</w:t>
-      </w:r>
-      <w:r>
-        <w:t xml:space="preserve"> </w:t>
-      </w:r>
-      <w:r>
-        <w:t xml:space="preserve">charts use and replies in plain English.</w:t>
-      </w:r>
-    </w:p>
-    <w:p>
-      <w:pPr>
-        <w:pStyle w:val="BodyText"/>
-      </w:pPr>
-      <w:r>
-        <w:t xml:space="preserve">You can ask it:</w:t>
-      </w:r>
-      <w:r>
-        <w:t xml:space="preserve"> </w:t>
-      </w:r>
-      <w:r>
-        <w:t xml:space="preserve">-</w:t>
-      </w:r>
-      <w:r>
-        <w:t xml:space="preserve"> </w:t>
-      </w:r>
-      <w:r>
-        <w:rPr>
-          <w:bCs/>
-          <w:b/>
-        </w:rPr>
-        <w:t xml:space="preserve">“</w:t>
-      </w:r>
-      <w:r>
-        <w:rPr>
-          <w:bCs/>
-          <w:b/>
-        </w:rPr>
-        <w:t xml:space="preserve">What’s happening?</w:t>
-      </w:r>
-      <w:r>
-        <w:rPr>
-          <w:bCs/>
-          <w:b/>
-        </w:rPr>
-        <w:t xml:space="preserve">”</w:t>
-      </w:r>
-      <w:r>
-        <w:t xml:space="preserve"> </w:t>
-      </w:r>
-      <w:r>
-        <w:t xml:space="preserve">→ a summary: the top signal, how many are high-priority, how many alerts.</w:t>
-      </w:r>
-      <w:r>
-        <w:t xml:space="preserve"> </w:t>
-      </w:r>
-      <w:r>
-        <w:t xml:space="preserve">-</w:t>
-      </w:r>
-      <w:r>
-        <w:t xml:space="preserve"> </w:t>
-      </w:r>
-      <w:r>
-        <w:rPr>
-          <w:bCs/>
-          <w:b/>
-        </w:rPr>
-        <w:t xml:space="preserve">“</w:t>
-      </w:r>
-      <w:r>
-        <w:rPr>
-          <w:bCs/>
-          <w:b/>
-        </w:rPr>
-        <w:t xml:space="preserve">What do I retime first?</w:t>
-      </w:r>
-      <w:r>
-        <w:rPr>
-          <w:bCs/>
-          <w:b/>
-        </w:rPr>
-        <w:t xml:space="preserve">”</w:t>
-      </w:r>
-      <w:r>
-        <w:t xml:space="preserve"> </w:t>
-      </w:r>
-      <w:r>
-        <w:t xml:space="preserve">→ the worst signal with its numbers and a</w:t>
-      </w:r>
-      <w:r>
-        <w:t xml:space="preserve"> </w:t>
-      </w:r>
-      <w:r>
-        <w:t xml:space="preserve">recommendation.</w:t>
-      </w:r>
-      <w:r>
-        <w:t xml:space="preserve"> </w:t>
-      </w:r>
-      <w:r>
-        <w:t xml:space="preserve">-</w:t>
-      </w:r>
-      <w:r>
-        <w:t xml:space="preserve"> </w:t>
-      </w:r>
-      <w:r>
-        <w:rPr>
-          <w:bCs/>
-          <w:b/>
-        </w:rPr>
-        <w:t xml:space="preserve">“</w:t>
-      </w:r>
-      <w:r>
-        <w:rPr>
-          <w:bCs/>
-          <w:b/>
-        </w:rPr>
-        <w:t xml:space="preserve">Any alerts?</w:t>
-      </w:r>
-      <w:r>
-        <w:rPr>
-          <w:bCs/>
-          <w:b/>
-        </w:rPr>
-        <w:t xml:space="preserve">”</w:t>
-      </w:r>
-      <w:r>
-        <w:t xml:space="preserve"> </w:t>
-      </w:r>
-      <w:r>
-        <w:t xml:space="preserve">→ the current anomaly list.</w:t>
-      </w:r>
-      <w:r>
-        <w:t xml:space="preserve"> </w:t>
-      </w:r>
-      <w:r>
-        <w:t xml:space="preserve">-</w:t>
-      </w:r>
-      <w:r>
-        <w:t xml:space="preserve"> </w:t>
-      </w:r>
-      <w:r>
-        <w:rPr>
-          <w:bCs/>
-          <w:b/>
-        </w:rPr>
-        <w:t xml:space="preserve">“</w:t>
-      </w:r>
-      <w:r>
-        <w:rPr>
-          <w:bCs/>
-          <w:b/>
-        </w:rPr>
-        <w:t xml:space="preserve">Why SIG-1003?</w:t>
-      </w:r>
-      <w:r>
-        <w:rPr>
-          <w:bCs/>
-          <w:b/>
-        </w:rPr>
-        <w:t xml:space="preserve">”</w:t>
-      </w:r>
-      <w:r>
-        <w:t xml:space="preserve"> </w:t>
-      </w:r>
-      <w:r>
-        <w:t xml:space="preserve">(any signal) → that intersection’s rank, score, and metrics, plus a button to open its detail drawer.</w:t>
-      </w:r>
-      <w:r>
-        <w:t xml:space="preserve"> </w:t>
-      </w:r>
-      <w:r>
-        <w:t xml:space="preserve">-</w:t>
-      </w:r>
-      <w:r>
-        <w:t xml:space="preserve"> </w:t>
-      </w:r>
-      <w:r>
-        <w:rPr>
-          <w:bCs/>
-          <w:b/>
-        </w:rPr>
-        <w:t xml:space="preserve">“</w:t>
-      </w:r>
-      <w:r>
-        <w:rPr>
-          <w:bCs/>
-          <w:b/>
-        </w:rPr>
-        <w:t xml:space="preserve">Explain the score</w:t>
-      </w:r>
-      <w:r>
-        <w:rPr>
-          <w:bCs/>
-          <w:b/>
-        </w:rPr>
-        <w:t xml:space="preserve">”</w:t>
-      </w:r>
-      <w:r>
-        <w:t xml:space="preserve">,</w:t>
-      </w:r>
-      <w:r>
-        <w:t xml:space="preserve"> </w:t>
-      </w:r>
-      <w:r>
-        <w:rPr>
-          <w:bCs/>
-          <w:b/>
-        </w:rPr>
-        <w:t xml:space="preserve">“</w:t>
-      </w:r>
-      <w:r>
-        <w:rPr>
-          <w:bCs/>
-          <w:b/>
-        </w:rPr>
-        <w:t xml:space="preserve">what is split failure</w:t>
-      </w:r>
-      <w:r>
-        <w:rPr>
-          <w:bCs/>
-          <w:b/>
-        </w:rPr>
-        <w:t xml:space="preserve">”</w:t>
-      </w:r>
-      <w:r>
-        <w:t xml:space="preserve">,</w:t>
-      </w:r>
-      <w:r>
-        <w:t xml:space="preserve"> </w:t>
-      </w:r>
-      <w:r>
-        <w:rPr>
-          <w:bCs/>
-          <w:b/>
-        </w:rPr>
-        <w:t xml:space="preserve">“</w:t>
-      </w:r>
-      <w:r>
-        <w:rPr>
-          <w:bCs/>
-          <w:b/>
-        </w:rPr>
-        <w:t xml:space="preserve">what is this / how does</w:t>
-      </w:r>
-      <w:r>
-        <w:rPr>
-          <w:bCs/>
-          <w:b/>
-        </w:rPr>
-        <w:t xml:space="preserve"> </w:t>
-      </w:r>
-      <w:r>
-        <w:rPr>
-          <w:bCs/>
-          <w:b/>
-        </w:rPr>
-        <w:t xml:space="preserve">it work / is this real data</w:t>
-      </w:r>
-      <w:r>
-        <w:rPr>
-          <w:bCs/>
-          <w:b/>
-        </w:rPr>
-        <w:t xml:space="preserve">”</w:t>
-      </w:r>
-      <w:r>
-        <w:t xml:space="preserve"> </w:t>
-      </w:r>
-      <w:r>
-        <w:t xml:space="preserve">→ it explains the project and the metrics.</w:t>
-      </w:r>
-    </w:p>
-    <w:p>
-      <w:pPr>
-        <w:pStyle w:val="BodyText"/>
-      </w:pPr>
-      <w:r>
-        <w:t xml:space="preserve">It’s a keyword-matched helper over the real data (not a free-form AI like ChatGPT),so every answer is accurate to what’s on screen. It also greets first-time visitors</w:t>
-      </w:r>
-      <w:r>
-        <w:t xml:space="preserve"> </w:t>
-      </w:r>
-      <w:r>
-        <w:t xml:space="preserve">with a small nudge dot, and respects</w:t>
-      </w:r>
-      <w:r>
-        <w:t xml:space="preserve"> </w:t>
-      </w:r>
-      <w:r>
-        <w:t xml:space="preserve">“</w:t>
-      </w:r>
-      <w:r>
-        <w:t xml:space="preserve">reduced motion</w:t>
-      </w:r>
-      <w:r>
-        <w:t xml:space="preserve">”</w:t>
-      </w:r>
-      <w:r>
-        <w:t xml:space="preserve"> </w:t>
-      </w:r>
-      <w:r>
-        <w:t xml:space="preserve">accessibility settings.</w:t>
-      </w:r>
-    </w:p>
-    <w:p>
-      <w:pPr>
-        <w:pStyle w:val="BlockText"/>
-      </w:pPr>
-      <w:r>
-        <w:t xml:space="preserve">Note: this is the</w:t>
-      </w:r>
-      <w:r>
-        <w:t xml:space="preserve"> </w:t>
-      </w:r>
-      <w:r>
-        <w:rPr>
-          <w:iCs/>
-          <w:i/>
-        </w:rPr>
-        <w:t xml:space="preserve">grounded</w:t>
-      </w:r>
-      <w:r>
-        <w:t xml:space="preserve"> </w:t>
-      </w:r>
-      <w:r>
-        <w:t xml:space="preserve">version (reliable, no key). A</w:t>
-      </w:r>
-      <w:r>
-        <w:t xml:space="preserve"> </w:t>
-      </w:r>
-      <w:r>
-        <w:rPr>
-          <w:iCs/>
-          <w:i/>
-        </w:rPr>
-        <w:t xml:space="preserve">Claude-powered</w:t>
-      </w:r>
-      <w:r>
-        <w:t xml:space="preserve"> </w:t>
-      </w:r>
-      <w:r>
-        <w:t xml:space="preserve">free-</w:t>
-      </w:r>
-      <w:r>
-        <w:t xml:space="preserve"> </w:t>
-      </w:r>
-      <w:r>
-        <w:t xml:space="preserve">form mode can be added later, it would need an API key and a small server piece.</w:t>
-      </w:r>
-    </w:p>
-    <w:p>
-      <w:r>
-        <w:pict>
-          <v:rect style="width:0;height:1.5pt" o:hralign="center" o:hrstd="t" o:hr="t"/>
-        </w:pict>
-      </w:r>
-    </w:p>
-    <w:bookmarkEnd w:id="26"/>
-    <w:bookmarkStart w:id="28" w:name="is-the-data-real"/>
-    <w:p>
-      <w:pPr>
-        <w:pStyle w:val="Heading2"/>
-      </w:pPr>
-      <w:r>
-        <w:t xml:space="preserve">7. Is the data real?</w:t>
+        <w:rPr>
+          <w:bCs/>
+          <w:b/>
+        </w:rPr>
+        <w:t xml:space="preserve">Corridors page</w:t>
+      </w:r>
+    </w:p>
+    <w:p>
+      <w:pPr>
+        <w:numPr>
+          <w:ilvl w:val="0"/>
+          <w:numId w:val="1003"/>
+        </w:numPr>
+        <w:pStyle w:val="Compact"/>
+      </w:pPr>
+      <w:r>
+        <w:rPr>
+          <w:bCs/>
+          <w:b/>
+        </w:rPr>
+        <w:t xml:space="preserve">Corridor Monitoring.</w:t>
+      </w:r>
+      <w:r>
+        <w:t xml:space="preserve"> </w:t>
+      </w:r>
+      <w:r>
+        <w:t xml:space="preserve">Signals grouped by corridor (e.g. State St), each card</w:t>
+      </w:r>
+      <w:r>
+        <w:t xml:space="preserve"> </w:t>
+      </w:r>
+      <w:r>
+        <w:t xml:space="preserve">showing average arrivals-on-red, average delay, split failures, signal count,</w:t>
+      </w:r>
+      <w:r>
+        <w:t xml:space="preserve"> </w:t>
+      </w:r>
+      <w:r>
+        <w:t xml:space="preserve">and a health score, sorted worst-first. Engineers manage corridors, not just</w:t>
+      </w:r>
+      <w:r>
+        <w:t xml:space="preserve"> </w:t>
+      </w:r>
+      <w:r>
+        <w:t xml:space="preserve">single intersections.</w:t>
       </w:r>
     </w:p>
     <w:p>
@@ -1627,7 +1448,7 @@
           <w:bCs/>
           <w:b/>
         </w:rPr>
-        <w:t xml:space="preserve">The analysis is 100% real. The underlying numbers are realistic sample data.</w:t>
+        <w:t xml:space="preserve">Everywhere</w:t>
       </w:r>
     </w:p>
     <w:p>
@@ -1643,22 +1464,47 @@
           <w:bCs/>
           <w:b/>
         </w:rPr>
-        <w:t xml:space="preserve">The brain is real</w:t>
-      </w:r>
-      <w:r>
-        <w:t xml:space="preserve">, the scoring, ranking, and anomaly detection are the exact</w:t>
-      </w:r>
-      <w:r>
-        <w:t xml:space="preserve"> </w:t>
-      </w:r>
-      <w:r>
-        <w:t xml:space="preserve">same calculations you’d run on live traffic data. Nothing about the method is</w:t>
-      </w:r>
-      <w:r>
-        <w:t xml:space="preserve"> </w:t>
-      </w:r>
-      <w:r>
-        <w:t xml:space="preserve">faked.</w:t>
+        <w:t xml:space="preserve">Signal detail drawer.</w:t>
+      </w:r>
+      <w:r>
+        <w:t xml:space="preserve"> </w:t>
+      </w:r>
+      <w:r>
+        <w:t xml:space="preserve">Click any signal (map, queue, incident) → a panel</w:t>
+      </w:r>
+      <w:r>
+        <w:t xml:space="preserve"> </w:t>
+      </w:r>
+      <w:r>
+        <w:t xml:space="preserve">slides in with its score, the score breakdown (55/30/15), current metrics, a</w:t>
+      </w:r>
+      <w:r>
+        <w:t xml:space="preserve"> </w:t>
+      </w:r>
+      <w:r>
+        <w:t xml:space="preserve">fault warning if a detector looks broken, and a</w:t>
+      </w:r>
+      <w:r>
+        <w:t xml:space="preserve"> </w:t>
+      </w:r>
+      <w:r>
+        <w:rPr>
+          <w:bCs/>
+          <w:b/>
+        </w:rPr>
+        <w:t xml:space="preserve">Performance Trend</w:t>
+      </w:r>
+      <w:r>
+        <w:t xml:space="preserve"> </w:t>
+      </w:r>
+      <w:r>
+        <w:t xml:space="preserve">with</w:t>
+      </w:r>
+      <w:r>
+        <w:t xml:space="preserve"> </w:t>
+      </w:r>
+      <w:r>
+        <w:t xml:space="preserve">Last 24h / 7d / 14d tabs so you can see if it is improving or deteriorating.</w:t>
       </w:r>
     </w:p>
     <w:p>
@@ -1674,265 +1520,19 @@
           <w:bCs/>
           <w:b/>
         </w:rPr>
-        <w:t xml:space="preserve">The data is generated</w:t>
-      </w:r>
-      <w:r>
-        <w:t xml:space="preserve">, a script (</w:t>
-      </w:r>
-      <w:r>
-        <w:rPr>
-          <w:rStyle w:val="VerbatimChar"/>
-        </w:rPr>
-        <w:t xml:space="preserve">scripts/generate_sample_data.py</w:t>
-      </w:r>
-      <w:r>
-        <w:t xml:space="preserve">) invents</w:t>
-      </w:r>
-      <w:r>
-        <w:t xml:space="preserve"> </w:t>
-      </w:r>
-      <w:r>
-        <w:t xml:space="preserve">14 days of hourly numbers for 12 intersections. It’s invented, but shaped to look</w:t>
-      </w:r>
-      <w:r>
-        <w:t xml:space="preserve"> </w:t>
-      </w:r>
-      <w:r>
-        <w:t xml:space="preserve">like real traffic (busy at rush hour) and built in the real industry format</w:t>
-      </w:r>
-      <w:r>
-        <w:t xml:space="preserve"> </w:t>
-      </w:r>
-      <w:r>
-        <w:t xml:space="preserve">(</w:t>
-      </w:r>
-      <w:r>
-        <w:rPr>
-          <w:bCs/>
-          <w:b/>
-        </w:rPr>
-        <w:t xml:space="preserve">ATSPM</w:t>
-      </w:r>
-      <w:r>
-        <w:t xml:space="preserve">, see below). It even bakes in two true-to-life stories: one chronic</w:t>
-      </w:r>
-      <w:r>
-        <w:t xml:space="preserve"> </w:t>
-      </w:r>
-      <w:r>
-        <w:t xml:space="preserve">problem signal (SIG-1003) and one with a broken sensor (SIG-1002).</w:t>
-      </w:r>
-    </w:p>
-    <w:p>
-      <w:pPr>
-        <w:pStyle w:val="FirstParagraph"/>
-      </w:pPr>
-      <w:r>
-        <w:rPr>
-          <w:bCs/>
-          <w:b/>
-        </w:rPr>
-        <w:t xml:space="preserve">Why sample data?</w:t>
-      </w:r>
-      <w:r>
-        <w:t xml:space="preserve"> </w:t>
-      </w:r>
-      <w:r>
-        <w:t xml:space="preserve">Real signal data isn’t freely downloadable by a program,agencies make you export it by hand from their website. So the project ships with</w:t>
-      </w:r>
-      <w:r>
-        <w:t xml:space="preserve"> </w:t>
-      </w:r>
-      <w:r>
-        <w:t xml:space="preserve">realistic stand-in data, and is built to accept real data with no code changes.</w:t>
-      </w:r>
-    </w:p>
-    <w:p>
-      <w:pPr>
-        <w:pStyle w:val="BodyText"/>
-      </w:pPr>
-      <w:r>
-        <w:rPr>
-          <w:bCs/>
-          <w:b/>
-        </w:rPr>
-        <w:t xml:space="preserve">Honest caveats (so nothing surprises you):</w:t>
-      </w:r>
-      <w:r>
-        <w:t xml:space="preserve"> </w:t>
-      </w:r>
-      <w:r>
-        <w:t xml:space="preserve">-</w:t>
-      </w:r>
-      <w:r>
-        <w:t xml:space="preserve"> </w:t>
-      </w:r>
-      <w:r>
-        <w:t xml:space="preserve">“</w:t>
-      </w:r>
-      <w:r>
-        <w:t xml:space="preserve">Last retimed</w:t>
-      </w:r>
-      <w:r>
-        <w:t xml:space="preserve">”</w:t>
-      </w:r>
-      <w:r>
-        <w:t xml:space="preserve"> </w:t>
-      </w:r>
-      <w:r>
-        <w:t xml:space="preserve">and</w:t>
-      </w:r>
-      <w:r>
-        <w:t xml:space="preserve"> </w:t>
-      </w:r>
-      <w:r>
-        <w:t xml:space="preserve">“</w:t>
-      </w:r>
-      <w:r>
-        <w:t xml:space="preserve">next maintenance window</w:t>
-      </w:r>
-      <w:r>
-        <w:t xml:space="preserve">”</w:t>
-      </w:r>
-      <w:r>
-        <w:t xml:space="preserve"> </w:t>
-      </w:r>
-      <w:r>
-        <w:t xml:space="preserve">are</w:t>
-      </w:r>
-      <w:r>
-        <w:t xml:space="preserve"> </w:t>
-      </w:r>
-      <w:r>
-        <w:rPr>
-          <w:bCs/>
-          <w:b/>
-        </w:rPr>
-        <w:t xml:space="preserve">cosmetic placeholders</w:t>
-      </w:r>
-      <w:r>
-        <w:t xml:space="preserve">, we</w:t>
-      </w:r>
-      <w:r>
-        <w:t xml:space="preserve"> </w:t>
-      </w:r>
-      <w:r>
-        <w:t xml:space="preserve">have no retiming-history data, so don’t present those as real.</w:t>
-      </w:r>
-      <w:r>
-        <w:t xml:space="preserve"> </w:t>
-      </w:r>
-      <w:r>
-        <w:t xml:space="preserve">- Pedestrian delay barely varies in the sample data, so that column looks flat.</w:t>
-      </w:r>
-    </w:p>
-    <w:bookmarkStart w:id="27" w:name="what-is-atspm"/>
-    <w:p>
-      <w:pPr>
-        <w:pStyle w:val="Heading3"/>
-      </w:pPr>
-      <w:r>
-        <w:t xml:space="preserve">What is</w:t>
-      </w:r>
-      <w:r>
-        <w:t xml:space="preserve"> </w:t>
-      </w:r>
-      <w:r>
-        <w:t xml:space="preserve">“</w:t>
-      </w:r>
-      <w:r>
-        <w:t xml:space="preserve">ATSPM</w:t>
-      </w:r>
-      <w:r>
-        <w:t xml:space="preserve">”</w:t>
-      </w:r>
-      <w:r>
-        <w:t xml:space="preserve">?</w:t>
-      </w:r>
-    </w:p>
-    <w:p>
-      <w:pPr>
-        <w:pStyle w:val="FirstParagraph"/>
-      </w:pPr>
-      <w:r>
-        <w:rPr>
-          <w:bCs/>
-          <w:b/>
-        </w:rPr>
-        <w:t xml:space="preserve">A</w:t>
-      </w:r>
-      <w:r>
-        <w:t xml:space="preserve">utomated</w:t>
-      </w:r>
-      <w:r>
-        <w:t xml:space="preserve"> </w:t>
-      </w:r>
-      <w:r>
-        <w:rPr>
-          <w:bCs/>
-          <w:b/>
-        </w:rPr>
-        <w:t xml:space="preserve">T</w:t>
-      </w:r>
-      <w:r>
-        <w:t xml:space="preserve">raffic</w:t>
-      </w:r>
-      <w:r>
-        <w:t xml:space="preserve"> </w:t>
-      </w:r>
-      <w:r>
-        <w:rPr>
-          <w:bCs/>
-          <w:b/>
-        </w:rPr>
-        <w:t xml:space="preserve">S</w:t>
-      </w:r>
-      <w:r>
-        <w:t xml:space="preserve">ignal</w:t>
-      </w:r>
-      <w:r>
-        <w:t xml:space="preserve"> </w:t>
-      </w:r>
-      <w:r>
-        <w:rPr>
-          <w:bCs/>
-          <w:b/>
-        </w:rPr>
-        <w:t xml:space="preserve">P</w:t>
-      </w:r>
-      <w:r>
-        <w:t xml:space="preserve">erformance</w:t>
-      </w:r>
-      <w:r>
-        <w:t xml:space="preserve"> </w:t>
-      </w:r>
-      <w:r>
-        <w:rPr>
-          <w:bCs/>
-          <w:b/>
-        </w:rPr>
-        <w:t xml:space="preserve">M</w:t>
-      </w:r>
-      <w:r>
-        <w:t xml:space="preserve">easures, the standard</w:t>
-      </w:r>
-      <w:r>
-        <w:t xml:space="preserve"> </w:t>
-      </w:r>
-      <w:r>
-        <w:t xml:space="preserve">format/layout traffic-signal data comes in (popularized by Utah’s DOT). Think of it</w:t>
-      </w:r>
-      <w:r>
-        <w:t xml:space="preserve"> </w:t>
-      </w:r>
-      <w:r>
-        <w:t xml:space="preserve">like how every bank statement has the same columns. This project uses that same</w:t>
-      </w:r>
-      <w:r>
-        <w:t xml:space="preserve"> </w:t>
-      </w:r>
-      <w:r>
-        <w:t xml:space="preserve">shape, so real exports drop straight in.</w:t>
+        <w:t xml:space="preserve">Theme toggle.</w:t>
+      </w:r>
+      <w:r>
+        <w:t xml:space="preserve"> </w:t>
+      </w:r>
+      <w:r>
+        <w:t xml:space="preserve">Dark (navy command center) or light. Follows your system</w:t>
+      </w:r>
+      <w:r>
+        <w:t xml:space="preserve"> </w:t>
+      </w:r>
+      <w:r>
+        <w:t xml:space="preserve">setting by default.</w:t>
       </w:r>
     </w:p>
     <w:p>
@@ -1942,15 +1542,444 @@
         </w:pict>
       </w:r>
     </w:p>
-    <w:bookmarkEnd w:id="27"/>
-    <w:bookmarkEnd w:id="28"/>
-    <w:bookmarkStart w:id="29" w:name="how-its-built"/>
+    <w:bookmarkEnd w:id="25"/>
+    <w:bookmarkStart w:id="26" w:name="the-chatbot-assistant-what-it-does"/>
     <w:p>
       <w:pPr>
         <w:pStyle w:val="Heading2"/>
       </w:pPr>
       <w:r>
-        <w:t xml:space="preserve">8. How it’s built</w:t>
+        <w:t xml:space="preserve">6. The chatbot / assistant: what it does</w:t>
+      </w:r>
+    </w:p>
+    <w:p>
+      <w:pPr>
+        <w:pStyle w:val="FirstParagraph"/>
+      </w:pPr>
+      <w:r>
+        <w:t xml:space="preserve">The floating chat button (bottom-right) opens a</w:t>
+      </w:r>
+      <w:r>
+        <w:t xml:space="preserve"> </w:t>
+      </w:r>
+      <w:r>
+        <w:rPr>
+          <w:bCs/>
+          <w:b/>
+        </w:rPr>
+        <w:t xml:space="preserve">grounded helper.</w:t>
+      </w:r>
+      <w:r>
+        <w:t xml:space="preserve"> </w:t>
+      </w:r>
+      <w:r>
+        <w:t xml:space="preserve">“</w:t>
+      </w:r>
+      <w:r>
+        <w:t xml:space="preserve">Grounded</w:t>
+      </w:r>
+      <w:r>
+        <w:t xml:space="preserve">”</w:t>
+      </w:r>
+      <w:r>
+        <w:t xml:space="preserve"> </w:t>
+      </w:r>
+      <w:r>
+        <w:t xml:space="preserve">means it answers</w:t>
+      </w:r>
+      <w:r>
+        <w:t xml:space="preserve"> </w:t>
+      </w:r>
+      <w:r>
+        <w:rPr>
+          <w:bCs/>
+          <w:b/>
+        </w:rPr>
+        <w:t xml:space="preserve">only from the dashboard’s live numbers</w:t>
+      </w:r>
+      <w:r>
+        <w:t xml:space="preserve">, it cannot make things</w:t>
+      </w:r>
+      <w:r>
+        <w:t xml:space="preserve"> </w:t>
+      </w:r>
+      <w:r>
+        <w:t xml:space="preserve">up, and it has no API key or internet call. It reads the same computed data the</w:t>
+      </w:r>
+      <w:r>
+        <w:t xml:space="preserve"> </w:t>
+      </w:r>
+      <w:r>
+        <w:t xml:space="preserve">charts use and replies in plain English.</w:t>
+      </w:r>
+    </w:p>
+    <w:p>
+      <w:pPr>
+        <w:pStyle w:val="BodyText"/>
+      </w:pPr>
+      <w:r>
+        <w:t xml:space="preserve">You can ask it:</w:t>
+      </w:r>
+      <w:r>
+        <w:t xml:space="preserve"> </w:t>
+      </w:r>
+      <w:r>
+        <w:t xml:space="preserve">-</w:t>
+      </w:r>
+      <w:r>
+        <w:t xml:space="preserve"> </w:t>
+      </w:r>
+      <w:r>
+        <w:rPr>
+          <w:bCs/>
+          <w:b/>
+        </w:rPr>
+        <w:t xml:space="preserve">“</w:t>
+      </w:r>
+      <w:r>
+        <w:rPr>
+          <w:bCs/>
+          <w:b/>
+        </w:rPr>
+        <w:t xml:space="preserve">What’s happening?</w:t>
+      </w:r>
+      <w:r>
+        <w:rPr>
+          <w:bCs/>
+          <w:b/>
+        </w:rPr>
+        <w:t xml:space="preserve">”</w:t>
+      </w:r>
+      <w:r>
+        <w:t xml:space="preserve"> </w:t>
+      </w:r>
+      <w:r>
+        <w:t xml:space="preserve">→ a summary: the top signal, how many are high-priority, how many alerts.</w:t>
+      </w:r>
+      <w:r>
+        <w:t xml:space="preserve"> </w:t>
+      </w:r>
+      <w:r>
+        <w:t xml:space="preserve">-</w:t>
+      </w:r>
+      <w:r>
+        <w:t xml:space="preserve"> </w:t>
+      </w:r>
+      <w:r>
+        <w:rPr>
+          <w:bCs/>
+          <w:b/>
+        </w:rPr>
+        <w:t xml:space="preserve">“</w:t>
+      </w:r>
+      <w:r>
+        <w:rPr>
+          <w:bCs/>
+          <w:b/>
+        </w:rPr>
+        <w:t xml:space="preserve">What do I retime first?</w:t>
+      </w:r>
+      <w:r>
+        <w:rPr>
+          <w:bCs/>
+          <w:b/>
+        </w:rPr>
+        <w:t xml:space="preserve">”</w:t>
+      </w:r>
+      <w:r>
+        <w:t xml:space="preserve"> </w:t>
+      </w:r>
+      <w:r>
+        <w:t xml:space="preserve">→ the worst signal with its numbers and a</w:t>
+      </w:r>
+      <w:r>
+        <w:t xml:space="preserve"> </w:t>
+      </w:r>
+      <w:r>
+        <w:t xml:space="preserve">recommendation.</w:t>
+      </w:r>
+      <w:r>
+        <w:t xml:space="preserve"> </w:t>
+      </w:r>
+      <w:r>
+        <w:t xml:space="preserve">-</w:t>
+      </w:r>
+      <w:r>
+        <w:t xml:space="preserve"> </w:t>
+      </w:r>
+      <w:r>
+        <w:rPr>
+          <w:bCs/>
+          <w:b/>
+        </w:rPr>
+        <w:t xml:space="preserve">“</w:t>
+      </w:r>
+      <w:r>
+        <w:rPr>
+          <w:bCs/>
+          <w:b/>
+        </w:rPr>
+        <w:t xml:space="preserve">Any alerts?</w:t>
+      </w:r>
+      <w:r>
+        <w:rPr>
+          <w:bCs/>
+          <w:b/>
+        </w:rPr>
+        <w:t xml:space="preserve">”</w:t>
+      </w:r>
+      <w:r>
+        <w:t xml:space="preserve"> </w:t>
+      </w:r>
+      <w:r>
+        <w:t xml:space="preserve">→ the current anomaly list.</w:t>
+      </w:r>
+      <w:r>
+        <w:t xml:space="preserve"> </w:t>
+      </w:r>
+      <w:r>
+        <w:t xml:space="preserve">-</w:t>
+      </w:r>
+      <w:r>
+        <w:t xml:space="preserve"> </w:t>
+      </w:r>
+      <w:r>
+        <w:rPr>
+          <w:bCs/>
+          <w:b/>
+        </w:rPr>
+        <w:t xml:space="preserve">“</w:t>
+      </w:r>
+      <w:r>
+        <w:rPr>
+          <w:bCs/>
+          <w:b/>
+        </w:rPr>
+        <w:t xml:space="preserve">Why SIG-1003?</w:t>
+      </w:r>
+      <w:r>
+        <w:rPr>
+          <w:bCs/>
+          <w:b/>
+        </w:rPr>
+        <w:t xml:space="preserve">”</w:t>
+      </w:r>
+      <w:r>
+        <w:t xml:space="preserve"> </w:t>
+      </w:r>
+      <w:r>
+        <w:t xml:space="preserve">(any signal) → that intersection’s rank, score, and metrics, plus a button to open its detail drawer.</w:t>
+      </w:r>
+      <w:r>
+        <w:t xml:space="preserve"> </w:t>
+      </w:r>
+      <w:r>
+        <w:t xml:space="preserve">-</w:t>
+      </w:r>
+      <w:r>
+        <w:t xml:space="preserve"> </w:t>
+      </w:r>
+      <w:r>
+        <w:rPr>
+          <w:bCs/>
+          <w:b/>
+        </w:rPr>
+        <w:t xml:space="preserve">“</w:t>
+      </w:r>
+      <w:r>
+        <w:rPr>
+          <w:bCs/>
+          <w:b/>
+        </w:rPr>
+        <w:t xml:space="preserve">Explain the score</w:t>
+      </w:r>
+      <w:r>
+        <w:rPr>
+          <w:bCs/>
+          <w:b/>
+        </w:rPr>
+        <w:t xml:space="preserve">”</w:t>
+      </w:r>
+      <w:r>
+        <w:t xml:space="preserve">,</w:t>
+      </w:r>
+      <w:r>
+        <w:t xml:space="preserve"> </w:t>
+      </w:r>
+      <w:r>
+        <w:rPr>
+          <w:bCs/>
+          <w:b/>
+        </w:rPr>
+        <w:t xml:space="preserve">“</w:t>
+      </w:r>
+      <w:r>
+        <w:rPr>
+          <w:bCs/>
+          <w:b/>
+        </w:rPr>
+        <w:t xml:space="preserve">what is split failure</w:t>
+      </w:r>
+      <w:r>
+        <w:rPr>
+          <w:bCs/>
+          <w:b/>
+        </w:rPr>
+        <w:t xml:space="preserve">”</w:t>
+      </w:r>
+      <w:r>
+        <w:t xml:space="preserve">,</w:t>
+      </w:r>
+      <w:r>
+        <w:t xml:space="preserve"> </w:t>
+      </w:r>
+      <w:r>
+        <w:rPr>
+          <w:bCs/>
+          <w:b/>
+        </w:rPr>
+        <w:t xml:space="preserve">“</w:t>
+      </w:r>
+      <w:r>
+        <w:rPr>
+          <w:bCs/>
+          <w:b/>
+        </w:rPr>
+        <w:t xml:space="preserve">what is this / how does</w:t>
+      </w:r>
+      <w:r>
+        <w:rPr>
+          <w:bCs/>
+          <w:b/>
+        </w:rPr>
+        <w:t xml:space="preserve"> </w:t>
+      </w:r>
+      <w:r>
+        <w:rPr>
+          <w:bCs/>
+          <w:b/>
+        </w:rPr>
+        <w:t xml:space="preserve">it work / is this real data</w:t>
+      </w:r>
+      <w:r>
+        <w:rPr>
+          <w:bCs/>
+          <w:b/>
+        </w:rPr>
+        <w:t xml:space="preserve">”</w:t>
+      </w:r>
+      <w:r>
+        <w:t xml:space="preserve"> </w:t>
+      </w:r>
+      <w:r>
+        <w:t xml:space="preserve">→ it explains the project and the metrics.</w:t>
+      </w:r>
+    </w:p>
+    <w:p>
+      <w:pPr>
+        <w:pStyle w:val="BodyText"/>
+      </w:pPr>
+      <w:r>
+        <w:t xml:space="preserve">It’s a keyword-matched helper over the real data (not a free-form AI like ChatGPT),so every answer is accurate to what’s on screen. It also greets first-time visitors</w:t>
+      </w:r>
+      <w:r>
+        <w:t xml:space="preserve"> </w:t>
+      </w:r>
+      <w:r>
+        <w:t xml:space="preserve">with a small nudge dot, and respects</w:t>
+      </w:r>
+      <w:r>
+        <w:t xml:space="preserve"> </w:t>
+      </w:r>
+      <w:r>
+        <w:t xml:space="preserve">“</w:t>
+      </w:r>
+      <w:r>
+        <w:t xml:space="preserve">reduced motion</w:t>
+      </w:r>
+      <w:r>
+        <w:t xml:space="preserve">”</w:t>
+      </w:r>
+      <w:r>
+        <w:t xml:space="preserve"> </w:t>
+      </w:r>
+      <w:r>
+        <w:t xml:space="preserve">accessibility settings.</w:t>
+      </w:r>
+    </w:p>
+    <w:p>
+      <w:pPr>
+        <w:pStyle w:val="BlockText"/>
+      </w:pPr>
+      <w:r>
+        <w:t xml:space="preserve">Note: this is the</w:t>
+      </w:r>
+      <w:r>
+        <w:t xml:space="preserve"> </w:t>
+      </w:r>
+      <w:r>
+        <w:rPr>
+          <w:iCs/>
+          <w:i/>
+        </w:rPr>
+        <w:t xml:space="preserve">grounded</w:t>
+      </w:r>
+      <w:r>
+        <w:t xml:space="preserve"> </w:t>
+      </w:r>
+      <w:r>
+        <w:t xml:space="preserve">version (reliable, no key). A</w:t>
+      </w:r>
+      <w:r>
+        <w:t xml:space="preserve"> </w:t>
+      </w:r>
+      <w:r>
+        <w:rPr>
+          <w:iCs/>
+          <w:i/>
+        </w:rPr>
+        <w:t xml:space="preserve">Claude-powered</w:t>
+      </w:r>
+      <w:r>
+        <w:t xml:space="preserve"> </w:t>
+      </w:r>
+      <w:r>
+        <w:t xml:space="preserve">free-</w:t>
+      </w:r>
+      <w:r>
+        <w:t xml:space="preserve"> </w:t>
+      </w:r>
+      <w:r>
+        <w:t xml:space="preserve">form mode can be added later, it would need an API key and a small server piece.</w:t>
+      </w:r>
+    </w:p>
+    <w:p>
+      <w:r>
+        <w:pict>
+          <v:rect style="width:0;height:1.5pt" o:hralign="center" o:hrstd="t" o:hr="t"/>
+        </w:pict>
+      </w:r>
+    </w:p>
+    <w:bookmarkEnd w:id="26"/>
+    <w:bookmarkStart w:id="28" w:name="is-the-data-real"/>
+    <w:p>
+      <w:pPr>
+        <w:pStyle w:val="Heading2"/>
+      </w:pPr>
+      <w:r>
+        <w:t xml:space="preserve">7. Is the data real?</w:t>
+      </w:r>
+    </w:p>
+    <w:p>
+      <w:pPr>
+        <w:pStyle w:val="FirstParagraph"/>
+      </w:pPr>
+      <w:r>
+        <w:rPr>
+          <w:bCs/>
+          <w:b/>
+        </w:rPr>
+        <w:t xml:space="preserve">The analysis is 100% real. The underlying numbers are realistic sample data.</w:t>
       </w:r>
     </w:p>
     <w:p>
@@ -1966,103 +1995,22 @@
           <w:bCs/>
           <w:b/>
         </w:rPr>
-        <w:t xml:space="preserve">Python pipeline (</w:t>
-      </w:r>
-      <w:r>
-        <w:rPr>
-          <w:rStyle w:val="VerbatimChar"/>
-          <w:bCs/>
-          <w:b/>
-        </w:rPr>
-        <w:t xml:space="preserve">src/</w:t>
-      </w:r>
-      <w:r>
-        <w:rPr>
-          <w:bCs/>
-          <w:b/>
-        </w:rPr>
-        <w:t xml:space="preserve">)</w:t>
-      </w:r>
-      <w:r>
-        <w:t xml:space="preserve">, the brain:</w:t>
-      </w:r>
-    </w:p>
-    <w:p>
-      <w:pPr>
-        <w:numPr>
-          <w:ilvl w:val="1"/>
-          <w:numId w:val="1006"/>
-        </w:numPr>
-        <w:pStyle w:val="Compact"/>
-      </w:pPr>
-      <w:r>
-        <w:rPr>
-          <w:rStyle w:val="VerbatimChar"/>
-        </w:rPr>
-        <w:t xml:space="preserve">clean_data.py</w:t>
-      </w:r>
-      <w:r>
-        <w:t xml:space="preserve">, loads and tidies the raw hourly data.</w:t>
-      </w:r>
-    </w:p>
-    <w:p>
-      <w:pPr>
-        <w:numPr>
-          <w:ilvl w:val="1"/>
-          <w:numId w:val="1006"/>
-        </w:numPr>
-        <w:pStyle w:val="Compact"/>
-      </w:pPr>
-      <w:r>
-        <w:rPr>
-          <w:rStyle w:val="VerbatimChar"/>
-        </w:rPr>
-        <w:t xml:space="preserve">analysis.py</w:t>
-      </w:r>
-      <w:r>
-        <w:t xml:space="preserve">, computes the composite priority score and ranking.</w:t>
-      </w:r>
-    </w:p>
-    <w:p>
-      <w:pPr>
-        <w:numPr>
-          <w:ilvl w:val="1"/>
-          <w:numId w:val="1006"/>
-        </w:numPr>
-        <w:pStyle w:val="Compact"/>
-      </w:pPr>
-      <w:r>
-        <w:rPr>
-          <w:rStyle w:val="VerbatimChar"/>
-        </w:rPr>
-        <w:t xml:space="preserve">model.py</w:t>
-      </w:r>
-      <w:r>
-        <w:t xml:space="preserve">, the anomaly detector (learns each signal’s normal pattern, flags</w:t>
-      </w:r>
-      <w:r>
-        <w:t xml:space="preserve"> </w:t>
-      </w:r>
-      <w:r>
-        <w:t xml:space="preserve">hours that are far off, that’s how it catches the broken sensor).</w:t>
-      </w:r>
-    </w:p>
-    <w:p>
-      <w:pPr>
-        <w:numPr>
-          <w:ilvl w:val="1"/>
-          <w:numId w:val="1006"/>
-        </w:numPr>
-        <w:pStyle w:val="Compact"/>
-      </w:pPr>
-      <w:r>
-        <w:rPr>
-          <w:rStyle w:val="VerbatimChar"/>
-        </w:rPr>
-        <w:t xml:space="preserve">app.py</w:t>
-      </w:r>
-      <w:r>
-        <w:t xml:space="preserve">, a Python/Streamlit version of the same analysis.</w:t>
+        <w:t xml:space="preserve">The brain is real</w:t>
+      </w:r>
+      <w:r>
+        <w:t xml:space="preserve">, the scoring, ranking, and anomaly detection are the exact</w:t>
+      </w:r>
+      <w:r>
+        <w:t xml:space="preserve"> </w:t>
+      </w:r>
+      <w:r>
+        <w:t xml:space="preserve">same calculations you’d run on live traffic data. Nothing about the method is</w:t>
+      </w:r>
+      <w:r>
+        <w:t xml:space="preserve"> </w:t>
+      </w:r>
+      <w:r>
+        <w:t xml:space="preserve">faked.</w:t>
       </w:r>
     </w:p>
     <w:p>
@@ -2078,154 +2026,53 @@
           <w:bCs/>
           <w:b/>
         </w:rPr>
-        <w:t xml:space="preserve">Web dashboard (</w:t>
+        <w:t xml:space="preserve">The data is generated</w:t>
+      </w:r>
+      <w:r>
+        <w:t xml:space="preserve">, a script (</w:t>
       </w:r>
       <w:r>
         <w:rPr>
           <w:rStyle w:val="VerbatimChar"/>
-          <w:bCs/>
-          <w:b/>
-        </w:rPr>
-        <w:t xml:space="preserve">index.html</w:t>
-      </w:r>
-      <w:r>
-        <w:rPr>
-          <w:bCs/>
-          <w:b/>
-        </w:rPr>
-        <w:t xml:space="preserve">,</w:t>
-      </w:r>
-      <w:r>
-        <w:rPr>
-          <w:bCs/>
-          <w:b/>
-        </w:rPr>
-        <w:t xml:space="preserve"> </w:t>
-      </w:r>
-      <w:r>
-        <w:rPr>
-          <w:rStyle w:val="VerbatimChar"/>
-          <w:bCs/>
-          <w:b/>
-        </w:rPr>
-        <w:t xml:space="preserve">app.css</w:t>
-      </w:r>
-      <w:r>
-        <w:rPr>
-          <w:bCs/>
-          <w:b/>
-        </w:rPr>
-        <w:t xml:space="preserve">,</w:t>
-      </w:r>
-      <w:r>
-        <w:rPr>
-          <w:bCs/>
-          <w:b/>
-        </w:rPr>
-        <w:t xml:space="preserve"> </w:t>
-      </w:r>
-      <w:r>
-        <w:rPr>
-          <w:rStyle w:val="VerbatimChar"/>
-          <w:bCs/>
-          <w:b/>
-        </w:rPr>
-        <w:t xml:space="preserve">app.js</w:t>
-      </w:r>
-      <w:r>
-        <w:rPr>
-          <w:bCs/>
-          <w:b/>
-        </w:rPr>
-        <w:t xml:space="preserve">)</w:t>
-      </w:r>
-      <w:r>
-        <w:t xml:space="preserve">, the navy command-center</w:t>
-      </w:r>
-      <w:r>
-        <w:t xml:space="preserve"> </w:t>
-      </w:r>
-      <w:r>
-        <w:t xml:space="preserve">UI. It recomputes everything live in the browser from</w:t>
-      </w:r>
-      <w:r>
-        <w:t xml:space="preserve"> </w:t>
-      </w:r>
-      <w:r>
-        <w:rPr>
-          <w:rStyle w:val="VerbatimChar"/>
-        </w:rPr>
-        <w:t xml:space="preserve">data.js</w:t>
-      </w:r>
-      <w:r>
-        <w:t xml:space="preserve">, so it’s fast and</w:t>
-      </w:r>
-      <w:r>
-        <w:t xml:space="preserve"> </w:t>
-      </w:r>
-      <w:r>
-        <w:t xml:space="preserve">needs no server.</w:t>
-      </w:r>
-    </w:p>
-    <w:p>
-      <w:pPr>
-        <w:numPr>
-          <w:ilvl w:val="0"/>
-          <w:numId w:val="1005"/>
-        </w:numPr>
-        <w:pStyle w:val="Compact"/>
-      </w:pPr>
-      <w:r>
-        <w:rPr>
-          <w:bCs/>
-          <w:b/>
-        </w:rPr>
-        <w:t xml:space="preserve">The bridge (</w:t>
-      </w:r>
-      <w:r>
-        <w:rPr>
-          <w:rStyle w:val="VerbatimChar"/>
-          <w:bCs/>
-          <w:b/>
-        </w:rPr>
-        <w:t xml:space="preserve">scripts/export_dashboard_data.py</w:t>
-      </w:r>
-      <w:r>
-        <w:rPr>
-          <w:bCs/>
-          <w:b/>
-        </w:rPr>
-        <w:t xml:space="preserve">)</w:t>
-      </w:r>
-      <w:r>
-        <w:t xml:space="preserve">, runs the Python pipeline</w:t>
-      </w:r>
-      <w:r>
-        <w:t xml:space="preserve"> </w:t>
-      </w:r>
-      <w:r>
-        <w:t xml:space="preserve">and writes</w:t>
-      </w:r>
-      <w:r>
-        <w:t xml:space="preserve"> </w:t>
-      </w:r>
-      <w:r>
-        <w:rPr>
-          <w:rStyle w:val="VerbatimChar"/>
-        </w:rPr>
-        <w:t xml:space="preserve">data.js</w:t>
-      </w:r>
-      <w:r>
-        <w:t xml:space="preserve"> </w:t>
-      </w:r>
-      <w:r>
-        <w:t xml:space="preserve">(the data the web app reads). Re-run it whenever the data</w:t>
-      </w:r>
-      <w:r>
-        <w:t xml:space="preserve"> </w:t>
-      </w:r>
-      <w:r>
-        <w:t xml:space="preserve">changes.</w:t>
+        </w:rPr>
+        <w:t xml:space="preserve">scripts/generate_sample_data.py</w:t>
+      </w:r>
+      <w:r>
+        <w:t xml:space="preserve">) invents</w:t>
+      </w:r>
+      <w:r>
+        <w:t xml:space="preserve"> </w:t>
+      </w:r>
+      <w:r>
+        <w:t xml:space="preserve">14 days of hourly numbers for 12 intersections. It’s invented, but shaped to look</w:t>
+      </w:r>
+      <w:r>
+        <w:t xml:space="preserve"> </w:t>
+      </w:r>
+      <w:r>
+        <w:t xml:space="preserve">like real traffic (busy at rush hour) and built in the real industry format</w:t>
+      </w:r>
+      <w:r>
+        <w:t xml:space="preserve"> </w:t>
+      </w:r>
+      <w:r>
+        <w:t xml:space="preserve">(</w:t>
+      </w:r>
+      <w:r>
+        <w:rPr>
+          <w:bCs/>
+          <w:b/>
+        </w:rPr>
+        <w:t xml:space="preserve">ATSPM</w:t>
+      </w:r>
+      <w:r>
+        <w:t xml:space="preserve">, see below). It even bakes in two true-to-life stories: one chronic</w:t>
+      </w:r>
+      <w:r>
+        <w:t xml:space="preserve"> </w:t>
+      </w:r>
+      <w:r>
+        <w:t xml:space="preserve">problem signal (SIG-1003) and one with a broken sensor (SIG-1002).</w:t>
       </w:r>
     </w:p>
     <w:p>
@@ -2233,7 +2080,342 @@
         <w:pStyle w:val="FirstParagraph"/>
       </w:pPr>
       <w:r>
-        <w:t xml:space="preserve">The web design came from a Claude Design mock and was implemented to match.</w:t>
+        <w:rPr>
+          <w:bCs/>
+          <w:b/>
+        </w:rPr>
+        <w:t xml:space="preserve">Why sample data?</w:t>
+      </w:r>
+      <w:r>
+        <w:t xml:space="preserve"> </w:t>
+      </w:r>
+      <w:r>
+        <w:t xml:space="preserve">Real signal data isn’t freely downloadable by a program,agencies make you export it by hand from their website. So the project ships with</w:t>
+      </w:r>
+      <w:r>
+        <w:t xml:space="preserve"> </w:t>
+      </w:r>
+      <w:r>
+        <w:t xml:space="preserve">realistic stand-in data, and is built to accept real data with no code changes.</w:t>
+      </w:r>
+    </w:p>
+    <w:p>
+      <w:pPr>
+        <w:pStyle w:val="BodyText"/>
+      </w:pPr>
+      <w:r>
+        <w:rPr>
+          <w:bCs/>
+          <w:b/>
+        </w:rPr>
+        <w:t xml:space="preserve">The map is real Salt Lake City.</w:t>
+      </w:r>
+      <w:r>
+        <w:t xml:space="preserve"> </w:t>
+      </w:r>
+      <w:r>
+        <w:t xml:space="preserve">The street map and the intersection locations</w:t>
+      </w:r>
+      <w:r>
+        <w:t xml:space="preserve"> </w:t>
+      </w:r>
+      <w:r>
+        <w:t xml:space="preserve">are genuine (the markers sit on real SLC corners, geocoded from the signal names).</w:t>
+      </w:r>
+      <w:r>
+        <w:t xml:space="preserve"> </w:t>
+      </w:r>
+      <w:r>
+        <w:t xml:space="preserve">Only the</w:t>
+      </w:r>
+      <w:r>
+        <w:t xml:space="preserve"> </w:t>
+      </w:r>
+      <w:r>
+        <w:rPr>
+          <w:iCs/>
+          <w:i/>
+        </w:rPr>
+        <w:t xml:space="preserve">performance readings</w:t>
+      </w:r>
+      <w:r>
+        <w:t xml:space="preserve"> </w:t>
+      </w:r>
+      <w:r>
+        <w:t xml:space="preserve">attached to them are sample data. Why Salt Lake?</w:t>
+      </w:r>
+      <w:r>
+        <w:t xml:space="preserve"> </w:t>
+      </w:r>
+      <w:r>
+        <w:t xml:space="preserve">Utah’s DOT created the ATSPM standard this is built on, so its naming is the</w:t>
+      </w:r>
+      <w:r>
+        <w:t xml:space="preserve"> </w:t>
+      </w:r>
+      <w:r>
+        <w:t xml:space="preserve">natural fit. The map logic works on any signals that have coordinates (e.g. New</w:t>
+      </w:r>
+      <w:r>
+        <w:t xml:space="preserve"> </w:t>
+      </w:r>
+      <w:r>
+        <w:t xml:space="preserve">Jersey).</w:t>
+      </w:r>
+    </w:p>
+    <w:p>
+      <w:pPr>
+        <w:pStyle w:val="BodyText"/>
+      </w:pPr>
+      <w:r>
+        <w:rPr>
+          <w:bCs/>
+          <w:b/>
+        </w:rPr>
+        <w:t xml:space="preserve">The dates roll to today.</w:t>
+      </w:r>
+      <w:r>
+        <w:t xml:space="preserve"> </w:t>
+      </w:r>
+      <w:r>
+        <w:t xml:space="preserve">The data window is regenerated to end on the current</w:t>
+      </w:r>
+      <w:r>
+        <w:t xml:space="preserve"> </w:t>
+      </w:r>
+      <w:r>
+        <w:t xml:space="preserve">day, so the</w:t>
+      </w:r>
+      <w:r>
+        <w:t xml:space="preserve"> </w:t>
+      </w:r>
+      <w:r>
+        <w:t xml:space="preserve">“</w:t>
+      </w:r>
+      <w:r>
+        <w:t xml:space="preserve">LIVE</w:t>
+      </w:r>
+      <w:r>
+        <w:t xml:space="preserve">”</w:t>
+      </w:r>
+      <w:r>
+        <w:t xml:space="preserve"> </w:t>
+      </w:r>
+      <w:r>
+        <w:t xml:space="preserve">label and timeline read as current. Re-run the export script to</w:t>
+      </w:r>
+      <w:r>
+        <w:t xml:space="preserve"> </w:t>
+      </w:r>
+      <w:r>
+        <w:t xml:space="preserve">refresh it (or it can be automated).</w:t>
+      </w:r>
+    </w:p>
+    <w:p>
+      <w:pPr>
+        <w:pStyle w:val="BodyText"/>
+      </w:pPr>
+      <w:r>
+        <w:rPr>
+          <w:bCs/>
+          <w:b/>
+        </w:rPr>
+        <w:t xml:space="preserve">Honest caveats (so nothing surprises you):</w:t>
+      </w:r>
+      <w:r>
+        <w:t xml:space="preserve"> </w:t>
+      </w:r>
+      <w:r>
+        <w:t xml:space="preserve">-</w:t>
+      </w:r>
+      <w:r>
+        <w:t xml:space="preserve"> </w:t>
+      </w:r>
+      <w:r>
+        <w:rPr>
+          <w:bCs/>
+          <w:b/>
+        </w:rPr>
+        <w:t xml:space="preserve">Traffic cameras</w:t>
+      </w:r>
+      <w:r>
+        <w:t xml:space="preserve"> </w:t>
+      </w:r>
+      <w:r>
+        <w:t xml:space="preserve">are placeholder/demo tiles, not live video.</w:t>
+      </w:r>
+      <w:r>
+        <w:t xml:space="preserve"> </w:t>
+      </w:r>
+      <w:r>
+        <w:t xml:space="preserve">-</w:t>
+      </w:r>
+      <w:r>
+        <w:t xml:space="preserve"> </w:t>
+      </w:r>
+      <w:r>
+        <w:rPr>
+          <w:bCs/>
+          <w:b/>
+        </w:rPr>
+        <w:t xml:space="preserve">Communication failures</w:t>
+      </w:r>
+      <w:r>
+        <w:t xml:space="preserve"> </w:t>
+      </w:r>
+      <w:r>
+        <w:t xml:space="preserve">and</w:t>
+      </w:r>
+      <w:r>
+        <w:t xml:space="preserve"> </w:t>
+      </w:r>
+      <w:r>
+        <w:rPr>
+          <w:bCs/>
+          <w:b/>
+        </w:rPr>
+        <w:t xml:space="preserve">“</w:t>
+      </w:r>
+      <w:r>
+        <w:rPr>
+          <w:bCs/>
+          <w:b/>
+        </w:rPr>
+        <w:t xml:space="preserve">Avg Delay</w:t>
+      </w:r>
+      <w:r>
+        <w:rPr>
+          <w:bCs/>
+          <w:b/>
+        </w:rPr>
+        <w:t xml:space="preserve">”</w:t>
+      </w:r>
+      <w:r>
+        <w:t xml:space="preserve"> </w:t>
+      </w:r>
+      <w:r>
+        <w:t xml:space="preserve">are simulated/derived fields</w:t>
+      </w:r>
+      <w:r>
+        <w:t xml:space="preserve"> </w:t>
+      </w:r>
+      <w:r>
+        <w:t xml:space="preserve">(avg delay is taken from pedestrian delay), so don’t present those as measured.</w:t>
+      </w:r>
+      <w:r>
+        <w:t xml:space="preserve"> </w:t>
+      </w:r>
+      <w:r>
+        <w:t xml:space="preserve">- Pedestrian delay barely varies in the sample data, so that column looks flat.</w:t>
+      </w:r>
+    </w:p>
+    <w:bookmarkStart w:id="27" w:name="what-is-atspm"/>
+    <w:p>
+      <w:pPr>
+        <w:pStyle w:val="Heading3"/>
+      </w:pPr>
+      <w:r>
+        <w:t xml:space="preserve">What is</w:t>
+      </w:r>
+      <w:r>
+        <w:t xml:space="preserve"> </w:t>
+      </w:r>
+      <w:r>
+        <w:t xml:space="preserve">“</w:t>
+      </w:r>
+      <w:r>
+        <w:t xml:space="preserve">ATSPM</w:t>
+      </w:r>
+      <w:r>
+        <w:t xml:space="preserve">”</w:t>
+      </w:r>
+      <w:r>
+        <w:t xml:space="preserve">?</w:t>
+      </w:r>
+    </w:p>
+    <w:p>
+      <w:pPr>
+        <w:pStyle w:val="FirstParagraph"/>
+      </w:pPr>
+      <w:r>
+        <w:rPr>
+          <w:bCs/>
+          <w:b/>
+        </w:rPr>
+        <w:t xml:space="preserve">A</w:t>
+      </w:r>
+      <w:r>
+        <w:t xml:space="preserve">utomated</w:t>
+      </w:r>
+      <w:r>
+        <w:t xml:space="preserve"> </w:t>
+      </w:r>
+      <w:r>
+        <w:rPr>
+          <w:bCs/>
+          <w:b/>
+        </w:rPr>
+        <w:t xml:space="preserve">T</w:t>
+      </w:r>
+      <w:r>
+        <w:t xml:space="preserve">raffic</w:t>
+      </w:r>
+      <w:r>
+        <w:t xml:space="preserve"> </w:t>
+      </w:r>
+      <w:r>
+        <w:rPr>
+          <w:bCs/>
+          <w:b/>
+        </w:rPr>
+        <w:t xml:space="preserve">S</w:t>
+      </w:r>
+      <w:r>
+        <w:t xml:space="preserve">ignal</w:t>
+      </w:r>
+      <w:r>
+        <w:t xml:space="preserve"> </w:t>
+      </w:r>
+      <w:r>
+        <w:rPr>
+          <w:bCs/>
+          <w:b/>
+        </w:rPr>
+        <w:t xml:space="preserve">P</w:t>
+      </w:r>
+      <w:r>
+        <w:t xml:space="preserve">erformance</w:t>
+      </w:r>
+      <w:r>
+        <w:t xml:space="preserve"> </w:t>
+      </w:r>
+      <w:r>
+        <w:rPr>
+          <w:bCs/>
+          <w:b/>
+        </w:rPr>
+        <w:t xml:space="preserve">M</w:t>
+      </w:r>
+      <w:r>
+        <w:t xml:space="preserve">easures, the standard</w:t>
+      </w:r>
+      <w:r>
+        <w:t xml:space="preserve"> </w:t>
+      </w:r>
+      <w:r>
+        <w:t xml:space="preserve">format/layout traffic-signal data comes in (popularized by Utah’s DOT). Think of it</w:t>
+      </w:r>
+      <w:r>
+        <w:t xml:space="preserve"> </w:t>
+      </w:r>
+      <w:r>
+        <w:t xml:space="preserve">like how every bank statement has the same columns. This project uses that same</w:t>
+      </w:r>
+      <w:r>
+        <w:t xml:space="preserve"> </w:t>
+      </w:r>
+      <w:r>
+        <w:t xml:space="preserve">shape, so real exports drop straight in.</w:t>
       </w:r>
     </w:p>
     <w:p>
@@ -2243,57 +2425,398 @@
         </w:pict>
       </w:r>
     </w:p>
-    <w:bookmarkEnd w:id="29"/>
-    <w:bookmarkStart w:id="30" w:name="X3f1cf61a92d2b06346d84e6d03fb20ef4d0d684"/>
+    <w:bookmarkEnd w:id="27"/>
+    <w:bookmarkEnd w:id="28"/>
+    <w:bookmarkStart w:id="29" w:name="how-its-built"/>
     <w:p>
       <w:pPr>
         <w:pStyle w:val="Heading2"/>
       </w:pPr>
       <w:r>
-        <w:t xml:space="preserve">9. How to make the data genuinely real (optional next step)</w:t>
+        <w:t xml:space="preserve">8. How it’s built</w:t>
       </w:r>
     </w:p>
     <w:p>
       <w:pPr>
         <w:numPr>
           <w:ilvl w:val="0"/>
+          <w:numId w:val="1006"/>
+        </w:numPr>
+        <w:pStyle w:val="Compact"/>
+      </w:pPr>
+      <w:r>
+        <w:rPr>
+          <w:bCs/>
+          <w:b/>
+        </w:rPr>
+        <w:t xml:space="preserve">Python pipeline (</w:t>
+      </w:r>
+      <w:r>
+        <w:rPr>
+          <w:rStyle w:val="VerbatimChar"/>
+          <w:bCs/>
+          <w:b/>
+        </w:rPr>
+        <w:t xml:space="preserve">src/</w:t>
+      </w:r>
+      <w:r>
+        <w:rPr>
+          <w:bCs/>
+          <w:b/>
+        </w:rPr>
+        <w:t xml:space="preserve">)</w:t>
+      </w:r>
+      <w:r>
+        <w:t xml:space="preserve">, the brain:</w:t>
+      </w:r>
+    </w:p>
+    <w:p>
+      <w:pPr>
+        <w:numPr>
+          <w:ilvl w:val="1"/>
           <w:numId w:val="1007"/>
         </w:numPr>
         <w:pStyle w:val="Compact"/>
       </w:pPr>
       <w:r>
-        <w:t xml:space="preserve">Go to the public UDOT ATSPM site and export the four metrics (split failures, approach volume, arrivals-on-red, pedestrian delay) as CSV files, done by hand, one metric at a time.</w:t>
+        <w:rPr>
+          <w:rStyle w:val="VerbatimChar"/>
+        </w:rPr>
+        <w:t xml:space="preserve">clean_data.py</w:t>
+      </w:r>
+      <w:r>
+        <w:t xml:space="preserve">, loads and tidies the raw hourly data.</w:t>
       </w:r>
     </w:p>
     <w:p>
       <w:pPr>
         <w:numPr>
-          <w:ilvl w:val="0"/>
+          <w:ilvl w:val="1"/>
           <w:numId w:val="1007"/>
         </w:numPr>
         <w:pStyle w:val="Compact"/>
       </w:pPr>
       <w:r>
-        <w:t xml:space="preserve">Drop those files into</w:t>
-      </w:r>
-      <w:r>
-        <w:t xml:space="preserve"> </w:t>
-      </w:r>
-      <w:r>
         <w:rPr>
           <w:rStyle w:val="VerbatimChar"/>
         </w:rPr>
-        <w:t xml:space="preserve">data/raw/udot/</w:t>
-      </w:r>
-      <w:r>
-        <w:t xml:space="preserve">.</w:t>
+        <w:t xml:space="preserve">analysis.py</w:t>
+      </w:r>
+      <w:r>
+        <w:t xml:space="preserve">, computes the composite priority score and ranking.</w:t>
+      </w:r>
+    </w:p>
+    <w:p>
+      <w:pPr>
+        <w:numPr>
+          <w:ilvl w:val="1"/>
+          <w:numId w:val="1007"/>
+        </w:numPr>
+        <w:pStyle w:val="Compact"/>
+      </w:pPr>
+      <w:r>
+        <w:rPr>
+          <w:rStyle w:val="VerbatimChar"/>
+        </w:rPr>
+        <w:t xml:space="preserve">model.py</w:t>
+      </w:r>
+      <w:r>
+        <w:t xml:space="preserve">, the anomaly detector (learns each signal’s normal pattern, flags</w:t>
+      </w:r>
+      <w:r>
+        <w:t xml:space="preserve"> </w:t>
+      </w:r>
+      <w:r>
+        <w:t xml:space="preserve">hours that are far off, that’s how it catches the broken sensor).</w:t>
+      </w:r>
+    </w:p>
+    <w:p>
+      <w:pPr>
+        <w:numPr>
+          <w:ilvl w:val="1"/>
+          <w:numId w:val="1007"/>
+        </w:numPr>
+        <w:pStyle w:val="Compact"/>
+      </w:pPr>
+      <w:r>
+        <w:rPr>
+          <w:rStyle w:val="VerbatimChar"/>
+        </w:rPr>
+        <w:t xml:space="preserve">app.py</w:t>
+      </w:r>
+      <w:r>
+        <w:t xml:space="preserve">, a Python/Streamlit version of the same analysis.</w:t>
       </w:r>
     </w:p>
     <w:p>
       <w:pPr>
         <w:numPr>
           <w:ilvl w:val="0"/>
-          <w:numId w:val="1007"/>
+          <w:numId w:val="1006"/>
+        </w:numPr>
+        <w:pStyle w:val="Compact"/>
+      </w:pPr>
+      <w:r>
+        <w:rPr>
+          <w:bCs/>
+          <w:b/>
+        </w:rPr>
+        <w:t xml:space="preserve">Web dashboard (</w:t>
+      </w:r>
+      <w:r>
+        <w:rPr>
+          <w:rStyle w:val="VerbatimChar"/>
+          <w:bCs/>
+          <w:b/>
+        </w:rPr>
+        <w:t xml:space="preserve">index.html</w:t>
+      </w:r>
+      <w:r>
+        <w:rPr>
+          <w:bCs/>
+          <w:b/>
+        </w:rPr>
+        <w:t xml:space="preserve">,</w:t>
+      </w:r>
+      <w:r>
+        <w:rPr>
+          <w:bCs/>
+          <w:b/>
+        </w:rPr>
+        <w:t xml:space="preserve"> </w:t>
+      </w:r>
+      <w:r>
+        <w:rPr>
+          <w:rStyle w:val="VerbatimChar"/>
+          <w:bCs/>
+          <w:b/>
+        </w:rPr>
+        <w:t xml:space="preserve">app.css</w:t>
+      </w:r>
+      <w:r>
+        <w:rPr>
+          <w:bCs/>
+          <w:b/>
+        </w:rPr>
+        <w:t xml:space="preserve">,</w:t>
+      </w:r>
+      <w:r>
+        <w:rPr>
+          <w:bCs/>
+          <w:b/>
+        </w:rPr>
+        <w:t xml:space="preserve"> </w:t>
+      </w:r>
+      <w:r>
+        <w:rPr>
+          <w:rStyle w:val="VerbatimChar"/>
+          <w:bCs/>
+          <w:b/>
+        </w:rPr>
+        <w:t xml:space="preserve">app.js</w:t>
+      </w:r>
+      <w:r>
+        <w:rPr>
+          <w:bCs/>
+          <w:b/>
+        </w:rPr>
+        <w:t xml:space="preserve">)</w:t>
+      </w:r>
+      <w:r>
+        <w:t xml:space="preserve">, the navy command-center</w:t>
+      </w:r>
+      <w:r>
+        <w:t xml:space="preserve"> </w:t>
+      </w:r>
+      <w:r>
+        <w:t xml:space="preserve">UI. It recomputes everything live in the browser from</w:t>
+      </w:r>
+      <w:r>
+        <w:t xml:space="preserve"> </w:t>
+      </w:r>
+      <w:r>
+        <w:rPr>
+          <w:rStyle w:val="VerbatimChar"/>
+        </w:rPr>
+        <w:t xml:space="preserve">data.js</w:t>
+      </w:r>
+      <w:r>
+        <w:t xml:space="preserve">, so it’s fast and</w:t>
+      </w:r>
+      <w:r>
+        <w:t xml:space="preserve"> </w:t>
+      </w:r>
+      <w:r>
+        <w:t xml:space="preserve">needs no server. The map uses</w:t>
+      </w:r>
+      <w:r>
+        <w:t xml:space="preserve"> </w:t>
+      </w:r>
+      <w:r>
+        <w:rPr>
+          <w:bCs/>
+          <w:b/>
+        </w:rPr>
+        <w:t xml:space="preserve">Leaflet</w:t>
+      </w:r>
+      <w:r>
+        <w:t xml:space="preserve"> </w:t>
+      </w:r>
+      <w:r>
+        <w:t xml:space="preserve">(vendored in</w:t>
+      </w:r>
+      <w:r>
+        <w:t xml:space="preserve"> </w:t>
+      </w:r>
+      <w:r>
+        <w:rPr>
+          <w:rStyle w:val="VerbatimChar"/>
+        </w:rPr>
+        <w:t xml:space="preserve">vendor/</w:t>
+      </w:r>
+      <w:r>
+        <w:t xml:space="preserve">, no CDN needed);</w:t>
+      </w:r>
+      <w:r>
+        <w:t xml:space="preserve"> </w:t>
+      </w:r>
+      <w:r>
+        <w:t xml:space="preserve">only the map tiles need internet.</w:t>
+      </w:r>
+    </w:p>
+    <w:p>
+      <w:pPr>
+        <w:numPr>
+          <w:ilvl w:val="0"/>
+          <w:numId w:val="1006"/>
+        </w:numPr>
+        <w:pStyle w:val="Compact"/>
+      </w:pPr>
+      <w:r>
+        <w:rPr>
+          <w:bCs/>
+          <w:b/>
+        </w:rPr>
+        <w:t xml:space="preserve">The bridge (</w:t>
+      </w:r>
+      <w:r>
+        <w:rPr>
+          <w:rStyle w:val="VerbatimChar"/>
+          <w:bCs/>
+          <w:b/>
+        </w:rPr>
+        <w:t xml:space="preserve">scripts/export_dashboard_data.py</w:t>
+      </w:r>
+      <w:r>
+        <w:rPr>
+          <w:bCs/>
+          <w:b/>
+        </w:rPr>
+        <w:t xml:space="preserve">)</w:t>
+      </w:r>
+      <w:r>
+        <w:t xml:space="preserve">, runs the Python pipeline</w:t>
+      </w:r>
+      <w:r>
+        <w:t xml:space="preserve"> </w:t>
+      </w:r>
+      <w:r>
+        <w:t xml:space="preserve">and writes</w:t>
+      </w:r>
+      <w:r>
+        <w:t xml:space="preserve"> </w:t>
+      </w:r>
+      <w:r>
+        <w:rPr>
+          <w:rStyle w:val="VerbatimChar"/>
+        </w:rPr>
+        <w:t xml:space="preserve">data.js</w:t>
+      </w:r>
+      <w:r>
+        <w:t xml:space="preserve"> </w:t>
+      </w:r>
+      <w:r>
+        <w:t xml:space="preserve">(the data the web app reads). Re-run it whenever the data</w:t>
+      </w:r>
+      <w:r>
+        <w:t xml:space="preserve"> </w:t>
+      </w:r>
+      <w:r>
+        <w:t xml:space="preserve">changes (it also rolls the dates to today).</w:t>
+      </w:r>
+    </w:p>
+    <w:p>
+      <w:pPr>
+        <w:pStyle w:val="FirstParagraph"/>
+      </w:pPr>
+      <w:r>
+        <w:t xml:space="preserve">The command-center design came from a Claude Design mock and was implemented to</w:t>
+      </w:r>
+      <w:r>
+        <w:t xml:space="preserve"> </w:t>
+      </w:r>
+      <w:r>
+        <w:t xml:space="preserve">match, wrapping the existing analytics in a Traffic Management Center layout.</w:t>
+      </w:r>
+    </w:p>
+    <w:p>
+      <w:r>
+        <w:pict>
+          <v:rect style="width:0;height:1.5pt" o:hralign="center" o:hrstd="t" o:hr="t"/>
+        </w:pict>
+      </w:r>
+    </w:p>
+    <w:bookmarkEnd w:id="29"/>
+    <w:bookmarkStart w:id="30" w:name="X3f1cf61a92d2b06346d84e6d03fb20ef4d0d684"/>
+    <w:p>
+      <w:pPr>
+        <w:pStyle w:val="Heading2"/>
+      </w:pPr>
+      <w:r>
+        <w:t xml:space="preserve">9. How to make the data genuinely real (optional next step)</w:t>
+      </w:r>
+    </w:p>
+    <w:p>
+      <w:pPr>
+        <w:numPr>
+          <w:ilvl w:val="0"/>
+          <w:numId w:val="1008"/>
+        </w:numPr>
+        <w:pStyle w:val="Compact"/>
+      </w:pPr>
+      <w:r>
+        <w:t xml:space="preserve">Go to the public UDOT ATSPM site and export the four metrics (split failures, approach volume, arrivals-on-red, pedestrian delay) as CSV files, done by hand, one metric at a time.</w:t>
+      </w:r>
+    </w:p>
+    <w:p>
+      <w:pPr>
+        <w:numPr>
+          <w:ilvl w:val="0"/>
+          <w:numId w:val="1008"/>
+        </w:numPr>
+        <w:pStyle w:val="Compact"/>
+      </w:pPr>
+      <w:r>
+        <w:t xml:space="preserve">Drop those files into</w:t>
+      </w:r>
+      <w:r>
+        <w:t xml:space="preserve"> </w:t>
+      </w:r>
+      <w:r>
+        <w:rPr>
+          <w:rStyle w:val="VerbatimChar"/>
+        </w:rPr>
+        <w:t xml:space="preserve">data/raw/udot/</w:t>
+      </w:r>
+      <w:r>
+        <w:t xml:space="preserve">.</w:t>
+      </w:r>
+    </w:p>
+    <w:p>
+      <w:pPr>
+        <w:numPr>
+          <w:ilvl w:val="0"/>
+          <w:numId w:val="1008"/>
         </w:numPr>
         <w:pStyle w:val="Compact"/>
       </w:pPr>
@@ -2856,6 +3379,9 @@
     <w:abstractNumId w:val="991"/>
   </w:num>
   <w:num w:numId="1007">
+    <w:abstractNumId w:val="991"/>
+  </w:num>
+  <w:num w:numId="1008">
     <w:abstractNumId w:val="99411"/>
     <w:lvlOverride w:ilvl="0">
       <w:startOverride w:val="1"/>

</xml_diff>